<commit_message>
docs(anexos): renomeia MARIA->MARIAH e nome por extenso nos documentos de public/
</commit_message>
<xml_diff>
--- a/public/guia-validacao-local-maria.docx
+++ b/public/guia-validacao-local-maria.docx
@@ -37,7 +37,7 @@
           <w:sz w:val="28"/>
           <w:szCs w:val="28"/>
         </w:rPr>
-        <w:t>Guia de Validação Local da MARIA pelos Comitês de Ética em Pesquisa</w:t>
+        <w:t>Guia de Validação Local da MARIAH pelos Comitês de Ética em Pesquisa</w:t>
       </w:r>
     </w:p>
     <w:tbl>
@@ -114,7 +114,7 @@
               <w:rPr>
                 <w:rFonts w:ascii="Times New Roman" w:hAnsi="Times New Roman" w:cs="Times New Roman"/>
               </w:rPr>
-              <w:t xml:space="preserve">Este apêndice oferece um roteiro prático para Comitês de Ética em Pesquisa que decidam, por iniciativa institucional própria, validar a Matriz MARIA na sua casuística. Não há plano nacional centralizado, não há adesão formal a consórcio, não há prazo de execução. Cada CEP roda o que lhe for útil, no ritmo que lhe couber. O retorno de resultados ao Grupo de Trabalho responsável pelo guia é facultativo e serve à evolução futura do instrumento. As três frentes propostas em F.2 </w:t>
+              <w:t xml:space="preserve">Este apêndice oferece um roteiro prático para Comitês de Ética em Pesquisa que decidam, por iniciativa institucional própria, validar a Matriz MARIAH na sua casuística. Não há plano nacional centralizado, não há adesão formal a consórcio, não há prazo de execução. Cada CEP roda o que lhe for útil, no ritmo que lhe couber. O retorno de resultados ao Grupo de Trabalho responsável pelo guia é facultativo e serve à evolução futura do instrumento. As três frentes propostas em F.2 </w:t>
             </w:r>
             <w:r>
               <w:rPr>
@@ -162,7 +162,7 @@
           <w:sz w:val="24"/>
           <w:szCs w:val="24"/>
         </w:rPr>
-        <w:t>F.1  Por que validar a MARIA na sua casuística</w:t>
+        <w:t>F.1  Por que validar a MARIAH na sua casuística</w:t>
       </w:r>
     </w:p>
     <w:p>
@@ -188,7 +188,7 @@
           <w:sz w:val="24"/>
           <w:szCs w:val="24"/>
         </w:rPr>
-        <w:t>O Capítulo 7 deste guia é explícito ao posicionar a MARIA como instrumento de apoio à deliberação do Comitê de Ética em Pesquisa, e não como norma que vincule sua decisão. A adoção da matriz é escolha institucional de cada CEP. Esse mesmo espírito orienta a validação: nenhum CEP é obrigado a validar a MARIA, e nenhum CEP precisa esperar decisão central para fazê-lo. Quando o colegiado entender que vale a pena verificar como a matriz se comporta nos protocolos que efetivamente lhe são submetidos, este apêndice oferece um roteiro prático para conduzir essa verificação.</w:t>
+        <w:t>O Capítulo 7 deste guia é explícito ao posicionar a MARIAH como instrumento de apoio à deliberação do Comitê de Ética em Pesquisa, e não como norma que vincule sua decisão. A adoção da matriz é escolha institucional de cada CEP. Esse mesmo espírito orienta a validação: nenhum CEP é obrigado a validar a MARIAH, e nenhum CEP precisa esperar decisão central para fazê-lo. Quando o colegiado entender que vale a pena verificar como a matriz se comporta nos protocolos que efetivamente lhe são submetidos, este apêndice oferece um roteiro prático para conduzir essa verificação.</w:t>
       </w:r>
     </w:p>
     <w:p>
@@ -244,7 +244,7 @@
           <w:sz w:val="24"/>
           <w:szCs w:val="24"/>
         </w:rPr>
-        <w:t xml:space="preserve">. A segunda é de qualificação institucional do parecer. Um CEP que demonstre, com base na sua própria casuística, que aplica a MARIA de modo consistente entre avaliadores, fortalece a credibilidade dos seus pareceres em protocolos com inteligência artificial perante pesquisadores, patrocinadores e a sociedade. A terceira é de contribuição opcional à evolução do instrumento. Os pontos de corte atuais da Versão B são, conforme o próprio Capítulo 7 reconhece, calibrações teóricas que </w:t>
+        <w:t xml:space="preserve">. A segunda é de qualificação institucional do parecer. Um CEP que demonstre, com base na sua própria casuística, que aplica a MARIAH de modo consistente entre avaliadores, fortalece a credibilidade dos seus pareceres em protocolos com inteligência artificial perante pesquisadores, patrocinadores e a sociedade. A terceira é de contribuição opcional à evolução do instrumento. Os pontos de corte atuais da Versão B são, conforme o próprio Capítulo 7 reconhece, calibrações teóricas que </w:t>
       </w:r>
       <w:r>
         <w:rPr>
@@ -398,7 +398,7 @@
           <w:sz w:val="24"/>
           <w:szCs w:val="24"/>
         </w:rPr>
-        <w:t xml:space="preserve"> do CEP, ao aplicarem a Versão A da MARIA ao mesmo protocolo de forma independente, chegam à mesma classificação. É a frente operacionalmente mais simples e a que rende, do ponto de vista de aprendizado institucional, o retorno mais imediato. O colegiado descobre rapidamente em quais eixos há leitura convergente e em quais há discordância sistemática, o que orienta diretamente o que precisa ser conversado em reunião plenária.</w:t>
+        <w:t xml:space="preserve"> do CEP, ao aplicarem a Versão A da MARIAH ao mesmo protocolo de forma independente, chegam à mesma classificação. É a frente operacionalmente mais simples e a que rende, do ponto de vista de aprendizado institucional, o retorno mais imediato. O colegiado descobre rapidamente em quais eixos há leitura convergente e em quais há discordância sistemática, o que orienta diretamente o que precisa ser conversado em reunião plenária.</w:t>
       </w:r>
     </w:p>
     <w:p>
@@ -476,7 +476,7 @@
           <w:sz w:val="24"/>
           <w:szCs w:val="24"/>
         </w:rPr>
-        <w:t xml:space="preserve">A segunda frente examina como os protocolos avaliados pelo CEP se distribuem nos quatro níveis da MARIA. Há dois usos principais para essa informação. O primeiro é descritivo. O CEP passa a conhecer o perfil da sua casuística em pesquisa com inteligência artificial: se a maioria dos protocolos se concentra no Nível II, se há protocolos no Nível IV, se a distribuição mudou ao longo do tempo. Essa informação é insumo de planejamento institucional e de capacitação do colegiado. O segundo uso é diagnóstico. </w:t>
+        <w:t xml:space="preserve">A segunda frente examina como os protocolos avaliados pelo CEP se distribuem nos quatro níveis da MARIAH. Há dois usos principais para essa informação. O primeiro é descritivo. O CEP passa a conhecer o perfil da sua casuística em pesquisa com inteligência artificial: se a maioria dos protocolos se concentra no Nível II, se há protocolos no Nível IV, se a distribuição mudou ao longo do tempo. Essa informação é insumo de planejamento institucional e de capacitação do colegiado. O segundo uso é diagnóstico. </w:t>
       </w:r>
       <w:r>
         <w:rPr>
@@ -1638,7 +1638,7 @@
           <w:sz w:val="24"/>
           <w:szCs w:val="24"/>
         </w:rPr>
-        <w:t>O software MARIA, descrito no Capítulo 7 e disponibilizado como Software Público Brasileiro, oferece uma camada operacional complementar: a aplicação das matrizes diretamente em formato digital, com exportação de relatórios padronizados. CEPs que prefiram operar o exercício de validação em ambiente digital podem fazê-lo exportando os relatórios e transferindo os dados para a planilha-modelo deste apêndice. O repositório oficial do software fica em github.com/Tonaco-13.</w:t>
+        <w:t>O software MARIAH, descrito no Capítulo 7 e disponibilizado como Software Público Brasileiro, oferece uma camada operacional complementar: a aplicação das matrizes diretamente em formato digital, com exportação de relatórios padronizados. CEPs que prefiram operar o exercício de validação em ambiente digital podem fazê-lo exportando os relatórios e transferindo os dados para a planilha-modelo deste apêndice. O repositório oficial do software fica em github.com/Tonaco-13.</w:t>
       </w:r>
     </w:p>
     <w:p>

</xml_diff>